<commit_message>
Oppdater etterlevelsesanalyse: FP 45 får FP 46 sitt oppmøte, FP 80 ekskludert
Co-Authored-By: Claude Sonnet 4.6 <noreply@anthropic.com>
</commit_message>
<xml_diff>
--- a/output/tables/tabell5_etterlevelse.docx
+++ b/output/tables/tabell5_etterlevelse.docx
@@ -178,7 +178,7 @@
                 <w:szCs w:val="20"/>
                 <w:color w:val="000000"/>
               </w:rPr>
-              <w:t xml:space="preserve">(n=20)</w:t>
+              <w:t xml:space="preserve">(n=19)</w:t>
             </w:r>
           </w:p>
         </w:tc>
@@ -340,7 +340,7 @@
                 <w:szCs w:val="20"/>
                 <w:color w:val="000000"/>
               </w:rPr>
-              <w:t xml:space="preserve">(n=49)</w:t>
+              <w:t xml:space="preserve">(n=48)</w:t>
             </w:r>
           </w:p>
         </w:tc>
@@ -510,7 +510,7 @@
                 <w:szCs w:val="20"/>
                 <w:color w:val="000000"/>
               </w:rPr>
-              <w:t xml:space="preserve">74.0 (30.7)</w:t>
+              <w:t xml:space="preserve">81.6 (18.1)</w:t>
             </w:r>
           </w:p>
         </w:tc>
@@ -620,7 +620,7 @@
                 <w:szCs w:val="20"/>
                 <w:color w:val="000000"/>
               </w:rPr>
-              <w:t xml:space="preserve">75.0 (25.2)</w:t>
+              <w:t xml:space="preserve">78.0 (20.0)</w:t>
             </w:r>
           </w:p>
         </w:tc>
@@ -675,7 +675,7 @@
                 <w:szCs w:val="20"/>
                 <w:color w:val="000000"/>
               </w:rPr>
-              <w:t xml:space="preserve">0.603</w:t>
+              <w:t xml:space="preserve">0.305</w:t>
             </w:r>
           </w:p>
         </w:tc>
@@ -790,7 +790,7 @@
                 <w:szCs w:val="20"/>
                 <w:color w:val="000000"/>
               </w:rPr>
-              <w:t xml:space="preserve">83.3</w:t>
+              <w:t xml:space="preserve">87.5</w:t>
             </w:r>
             <w:r>
               <w:rPr>
@@ -816,7 +816,7 @@
                 <w:szCs w:val="20"/>
                 <w:color w:val="000000"/>
               </w:rPr>
-              <w:t xml:space="preserve">(71.9–95.8)</w:t>
+              <w:t xml:space="preserve">(75.0–95.8)</w:t>
             </w:r>
           </w:p>
         </w:tc>
@@ -978,7 +978,7 @@
                 <w:szCs w:val="20"/>
                 <w:color w:val="000000"/>
               </w:rPr>
-              <w:t xml:space="preserve">(66.7–91.7)</w:t>
+              <w:t xml:space="preserve">(70.8–91.7)</w:t>
             </w:r>
           </w:p>
         </w:tc>
@@ -1062,7 +1062,7 @@
           <w:szCs w:val="16"/>
           <w:color w:val="000000"/>
         </w:rPr>
-        <w:t xml:space="preserve">Etterlevelse er beregnet som andel gjennomførte økter av totalt 24 planlagte økter (2 økter per uke × 12 uker). P-verdi er beregnet med Wilcoxon rank-sum test. 1 deltaker mangler oppmøteregistrering og er ikke inkludert i beregningen (n = 49).</w:t>
+        <w:t xml:space="preserve">Etterlevelse er beregnet som andel gjennomførte økter av totalt 24 planlagte økter (2 økter per uke × 12 uker). P-verdi er beregnet med Wilcoxon rank-sum test. 2 deltakere er ekskludert fra etterlevelsesanalysen grunnet manglende eller ugyldig oppmøteregistrering (n = 48).</w:t>
       </w:r>
     </w:p>
     <w:sectPr>

</xml_diff>

<commit_message>
Add n=70 baseline and adherence tables, keep n=50 as _komplett_dxa versions
Co-Authored-By: Claude Sonnet 4.6 <noreply@anthropic.com>
</commit_message>
<xml_diff>
--- a/output/tables/tabell5_etterlevelse.docx
+++ b/output/tables/tabell5_etterlevelse.docx
@@ -178,7 +178,7 @@
                 <w:szCs w:val="20"/>
                 <w:color w:val="000000"/>
               </w:rPr>
-              <w:t xml:space="preserve">(n=19)</w:t>
+              <w:t xml:space="preserve">(n=27)</w:t>
             </w:r>
           </w:p>
         </w:tc>
@@ -259,7 +259,7 @@
                 <w:szCs w:val="20"/>
                 <w:color w:val="000000"/>
               </w:rPr>
-              <w:t xml:space="preserve">(n=29)</w:t>
+              <w:t xml:space="preserve">(n=35)</w:t>
             </w:r>
           </w:p>
         </w:tc>
@@ -340,7 +340,7 @@
                 <w:szCs w:val="20"/>
                 <w:color w:val="000000"/>
               </w:rPr>
-              <w:t xml:space="preserve">(n=48)</w:t>
+              <w:t xml:space="preserve">(n=62)</w:t>
             </w:r>
           </w:p>
         </w:tc>
@@ -510,7 +510,7 @@
                 <w:szCs w:val="20"/>
                 <w:color w:val="000000"/>
               </w:rPr>
-              <w:t xml:space="preserve">81.6 (18.1)</w:t>
+              <w:t xml:space="preserve">62.0 (37.4)</w:t>
             </w:r>
           </w:p>
         </w:tc>
@@ -565,7 +565,7 @@
                 <w:szCs w:val="20"/>
                 <w:color w:val="000000"/>
               </w:rPr>
-              <w:t xml:space="preserve">75.7 (21.2)</w:t>
+              <w:t xml:space="preserve">71.3 (24.7)</w:t>
             </w:r>
           </w:p>
         </w:tc>
@@ -620,7 +620,7 @@
                 <w:szCs w:val="20"/>
                 <w:color w:val="000000"/>
               </w:rPr>
-              <w:t xml:space="preserve">78.0 (20.0)</w:t>
+              <w:t xml:space="preserve">67.3 (31.0)</w:t>
             </w:r>
           </w:p>
         </w:tc>
@@ -675,7 +675,7 @@
                 <w:szCs w:val="20"/>
                 <w:color w:val="000000"/>
               </w:rPr>
-              <w:t xml:space="preserve">0.305</w:t>
+              <w:t xml:space="preserve">0.613</w:t>
             </w:r>
           </w:p>
         </w:tc>
@@ -790,7 +790,7 @@
                 <w:szCs w:val="20"/>
                 <w:color w:val="000000"/>
               </w:rPr>
-              <w:t xml:space="preserve">87.5</w:t>
+              <w:t xml:space="preserve">75.0</w:t>
             </w:r>
             <w:r>
               <w:rPr>
@@ -816,7 +816,7 @@
                 <w:szCs w:val="20"/>
                 <w:color w:val="000000"/>
               </w:rPr>
-              <w:t xml:space="preserve">(75.0–95.8)</w:t>
+              <w:t xml:space="preserve">(41.7–91.7)</w:t>
             </w:r>
           </w:p>
         </w:tc>
@@ -871,7 +871,7 @@
                 <w:szCs w:val="20"/>
                 <w:color w:val="000000"/>
               </w:rPr>
-              <w:t xml:space="preserve">83.3</w:t>
+              <w:t xml:space="preserve">79.2</w:t>
             </w:r>
             <w:r>
               <w:rPr>
@@ -897,7 +897,7 @@
                 <w:szCs w:val="20"/>
                 <w:color w:val="000000"/>
               </w:rPr>
-              <w:t xml:space="preserve">(66.7–91.7)</w:t>
+              <w:t xml:space="preserve">(62.5–89.6)</w:t>
             </w:r>
           </w:p>
         </w:tc>
@@ -952,7 +952,7 @@
                 <w:szCs w:val="20"/>
                 <w:color w:val="000000"/>
               </w:rPr>
-              <w:t xml:space="preserve">83.3</w:t>
+              <w:t xml:space="preserve">77.1</w:t>
             </w:r>
             <w:r>
               <w:rPr>
@@ -978,7 +978,7 @@
                 <w:szCs w:val="20"/>
                 <w:color w:val="000000"/>
               </w:rPr>
-              <w:t xml:space="preserve">(70.8–91.7)</w:t>
+              <w:t xml:space="preserve">(54.2–91.7)</w:t>
             </w:r>
           </w:p>
         </w:tc>

</xml_diff>